<commit_message>
Added repository link to assignment document
</commit_message>
<xml_diff>
--- a/module-6/Cortez-Movies-Table-Queries.docx
+++ b/module-6/Cortez-Movies-Table-Queries.docx
@@ -71,7 +71,15 @@
     </w:p>
     <w:p>
       <w:r>
-        <w:t>The purpose of this assignment is to demonstrate how Python connects to a MySQL database using the mysql.connector library. The program executes SQL queries against the Movies database, retrieves records from multiple tables, displays the results, and properly closes the database connection.</w:t>
+        <w:t xml:space="preserve">The purpose of this assignment is to demonstrate how Python connects to a MySQL database using the </w:t>
+      </w:r>
+      <w:proofErr w:type="spellStart"/>
+      <w:r>
+        <w:t>mysql.connector</w:t>
+      </w:r>
+      <w:proofErr w:type="spellEnd"/>
+      <w:r>
+        <w:t xml:space="preserve"> library. The program executes SQL queries against the Movies database, retrieves records from multiple tables, displays the results, and properly closes the database connection.</w:t>
       </w:r>
     </w:p>
     <w:p/>
@@ -130,6 +138,9 @@
     </w:p>
     <w:p>
       <w:r>
+        <w:rPr>
+          <w:noProof/>
+        </w:rPr>
         <w:lastRenderedPageBreak/>
         <w:drawing>
           <wp:inline distT="0" distB="0" distL="0" distR="0" wp14:anchorId="3F8FD4F6" wp14:editId="44B45314">
@@ -217,6 +228,9 @@
     </w:p>
     <w:p>
       <w:r>
+        <w:rPr>
+          <w:noProof/>
+        </w:rPr>
         <w:lastRenderedPageBreak/>
         <w:drawing>
           <wp:inline distT="0" distB="0" distL="0" distR="0" wp14:anchorId="6FA7CFE3" wp14:editId="0B17EAC9">
@@ -269,8 +283,21 @@
     <w:p/>
     <w:p>
       <w:r>
-        <w:t>SELECT film_name, film_runtime</w:t>
-      </w:r>
+        <w:t xml:space="preserve">SELECT </w:t>
+      </w:r>
+      <w:proofErr w:type="spellStart"/>
+      <w:r>
+        <w:t>film_name</w:t>
+      </w:r>
+      <w:proofErr w:type="spellEnd"/>
+      <w:r>
+        <w:t xml:space="preserve">, </w:t>
+      </w:r>
+      <w:proofErr w:type="spellStart"/>
+      <w:r>
+        <w:t>film_runtime</w:t>
+      </w:r>
+      <w:proofErr w:type="spellEnd"/>
     </w:p>
     <w:p>
       <w:r>
@@ -279,7 +306,15 @@
     </w:p>
     <w:p>
       <w:r>
-        <w:t>WHERE film_runtime &lt; 120;</w:t>
+        <w:t xml:space="preserve">WHERE </w:t>
+      </w:r>
+      <w:proofErr w:type="spellStart"/>
+      <w:r>
+        <w:t>film_runtime</w:t>
+      </w:r>
+      <w:proofErr w:type="spellEnd"/>
+      <w:r>
+        <w:t xml:space="preserve"> &lt; 120;</w:t>
       </w:r>
     </w:p>
     <w:p/>
@@ -300,6 +335,9 @@
     <w:p/>
     <w:p>
       <w:r>
+        <w:rPr>
+          <w:noProof/>
+        </w:rPr>
         <w:lastRenderedPageBreak/>
         <w:drawing>
           <wp:inline distT="0" distB="0" distL="0" distR="0" wp14:anchorId="43F8A923" wp14:editId="0CBD7C8B">
@@ -352,8 +390,21 @@
     <w:p/>
     <w:p>
       <w:r>
-        <w:t>SELECT film_name, film_director</w:t>
-      </w:r>
+        <w:t xml:space="preserve">SELECT </w:t>
+      </w:r>
+      <w:proofErr w:type="spellStart"/>
+      <w:r>
+        <w:t>film_name</w:t>
+      </w:r>
+      <w:proofErr w:type="spellEnd"/>
+      <w:r>
+        <w:t xml:space="preserve">, </w:t>
+      </w:r>
+      <w:proofErr w:type="spellStart"/>
+      <w:r>
+        <w:t>film_director</w:t>
+      </w:r>
+      <w:proofErr w:type="spellEnd"/>
     </w:p>
     <w:p>
       <w:r>
@@ -362,7 +413,15 @@
     </w:p>
     <w:p>
       <w:r>
-        <w:t>ORDER BY film_director;</w:t>
+        <w:t xml:space="preserve">ORDER BY </w:t>
+      </w:r>
+      <w:proofErr w:type="spellStart"/>
+      <w:r>
+        <w:t>film_director</w:t>
+      </w:r>
+      <w:proofErr w:type="spellEnd"/>
+      <w:r>
+        <w:t>;</w:t>
       </w:r>
     </w:p>
     <w:p/>
@@ -383,6 +442,9 @@
     <w:p/>
     <w:p>
       <w:r>
+        <w:rPr>
+          <w:noProof/>
+        </w:rPr>
         <w:lastRenderedPageBreak/>
         <w:drawing>
           <wp:inline distT="0" distB="0" distL="0" distR="0" wp14:anchorId="55395D9D" wp14:editId="4A0E5249">
@@ -422,7 +484,80 @@
       </w:r>
     </w:p>
     <w:p/>
-    <w:p/>
+    <w:p>
+      <w:pPr>
+        <w:rPr>
+          <w:b/>
+          <w:bCs/>
+        </w:rPr>
+      </w:pPr>
+      <w:r>
+        <w:rPr>
+          <w:b/>
+          <w:bCs/>
+        </w:rPr>
+        <w:t>GitHub Repository</w:t>
+      </w:r>
+    </w:p>
+    <w:p>
+      <w:pPr>
+        <w:rPr>
+          <w:b/>
+          <w:bCs/>
+        </w:rPr>
+      </w:pPr>
+    </w:p>
+    <w:p>
+      <w:pPr>
+        <w:rPr>
+          <w:rStyle w:val="Hyperlink"/>
+        </w:rPr>
+      </w:pPr>
+      <w:r>
+        <w:rPr>
+          <w:b/>
+          <w:bCs/>
+        </w:rPr>
+        <w:fldChar w:fldCharType="begin"/>
+      </w:r>
+      <w:r>
+        <w:rPr>
+          <w:b/>
+          <w:bCs/>
+        </w:rPr>
+        <w:instrText>HYPERLINK "https://github.com/LUISCORTEZUSA2018/csd-310"</w:instrText>
+      </w:r>
+      <w:r>
+        <w:rPr>
+          <w:b/>
+          <w:bCs/>
+        </w:rPr>
+      </w:r>
+      <w:r>
+        <w:rPr>
+          <w:b/>
+          <w:bCs/>
+        </w:rPr>
+        <w:fldChar w:fldCharType="separate"/>
+      </w:r>
+      <w:r>
+        <w:rPr>
+          <w:rStyle w:val="Hyperlink"/>
+          <w:b/>
+          <w:bCs/>
+        </w:rPr>
+        <w:t>https://github.com/LUISCORTEZUSA2018/csd-310</w:t>
+      </w:r>
+    </w:p>
+    <w:p>
+      <w:r>
+        <w:rPr>
+          <w:b/>
+          <w:bCs/>
+        </w:rPr>
+        <w:fldChar w:fldCharType="end"/>
+      </w:r>
+    </w:p>
     <w:p/>
     <w:p/>
     <w:sectPr>
@@ -1351,6 +1486,29 @@
       <w:spacing w:val="5"/>
     </w:rPr>
   </w:style>
+  <w:style w:type="character" w:styleId="Hyperlink">
+    <w:name w:val="Hyperlink"/>
+    <w:basedOn w:val="DefaultParagraphFont"/>
+    <w:uiPriority w:val="99"/>
+    <w:unhideWhenUsed/>
+    <w:rsid w:val="005B0CE7"/>
+    <w:rPr>
+      <w:color w:val="467886" w:themeColor="hyperlink"/>
+      <w:u w:val="single"/>
+    </w:rPr>
+  </w:style>
+  <w:style w:type="character" w:styleId="UnresolvedMention">
+    <w:name w:val="Unresolved Mention"/>
+    <w:basedOn w:val="DefaultParagraphFont"/>
+    <w:uiPriority w:val="99"/>
+    <w:semiHidden/>
+    <w:unhideWhenUsed/>
+    <w:rsid w:val="005B0CE7"/>
+    <w:rPr>
+      <w:color w:val="605E5C"/>
+      <w:shd w:val="clear" w:color="auto" w:fill="E1DFDD"/>
+    </w:rPr>
+  </w:style>
 </w:styles>
 </file>
 

</xml_diff>